<commit_message>
Refine BTS referentials labels and French text
</commit_message>
<xml_diff>
--- a/downloads/fiches/bts_analyses_de_biologie_medicale_fiche_evaluation.docx
+++ b/downloads/fiches/bts_analyses_de_biologie_medicale_fiche_evaluation.docx
@@ -13,7 +13,7 @@
           <w:sz w:val="32"/>
           <w:lang w:val="fr-FR" w:eastAsia="fr-FR" w:bidi="fr-FR"/>
         </w:rPr>
-        <w:t>Fiche d'évaluation reconstituée - BTS Analysés de biologie medicale</w:t>
+        <w:t>Fiche d'évaluation reconstituée - BTS Analysés de biologie médicale</w:t>
       </w:r>
     </w:p>
     <w:p>
@@ -26,7 +26,7 @@
           <w:sz w:val="21"/>
           <w:lang w:val="fr-FR" w:eastAsia="fr-FR" w:bidi="fr-FR"/>
         </w:rPr>
-        <w:t>Support évalué : Rapport de stage / rapport d'activités | Modalité : CCF</w:t>
+        <w:t>Support évalué : Rapport de stage / rapport d'activités | Modalité : À confirmer</w:t>
       </w:r>
     </w:p>
     <w:p>
@@ -51,7 +51,7 @@
           <w:i/>
           <w:lang w:val="fr-FR" w:eastAsia="fr-FR" w:bidi="fr-FR"/>
         </w:rPr>
-        <w:t>Cette fiche est une reconstitution de travail à partir des sources publiques repérées au 2026-05-06. Elle ne remplace pas un formulaire national opposable lorsqu'une grille officielle complète existe par ailleurs.</w:t>
+        <w:t>Cette fiche est une reconstitution de travail à partir des sources publiques repérées au 2026-05-06. Elle ne remplace pas un formulaire national opposable lorsqu'une grille officielle complète existe par ailleurs. La modalité exacte (CCF ou ponctuelle) reste à confirmer sur la base des textes disponibles.</w:t>
       </w:r>
     </w:p>
     <w:tbl>
@@ -94,7 +94,7 @@
               <w:rPr>
                 <w:lang w:val="fr-FR" w:eastAsia="fr-FR" w:bidi="fr-FR"/>
               </w:rPr>
-              <w:t>BTS Analysés de biologie medicale</w:t>
+              <w:t>BTS Analysés de biologie médicale</w:t>
             </w:r>
           </w:p>
         </w:tc>
@@ -124,7 +124,7 @@
               <w:rPr>
                 <w:lang w:val="fr-FR" w:eastAsia="fr-FR" w:bidi="fr-FR"/>
               </w:rPr>
-              <w:t>CCF</w:t>
+              <w:t>À confirmer</w:t>
             </w:r>
           </w:p>
         </w:tc>
@@ -186,7 +186,7 @@
               <w:rPr>
                 <w:lang w:val="fr-FR" w:eastAsia="fr-FR" w:bidi="fr-FR"/>
               </w:rPr>
-              <w:t>CCF confirme</w:t>
+              <w:t>CCF confirmé</w:t>
             </w:r>
           </w:p>
         </w:tc>
@@ -280,7 +280,7 @@
               <w:rPr>
                 <w:lang w:val="fr-FR" w:eastAsia="fr-FR" w:bidi="fr-FR"/>
               </w:rPr>
-              <w:t>CCF confirme</w:t>
+              <w:t>CCF confirmé</w:t>
             </w:r>
           </w:p>
         </w:tc>
@@ -823,7 +823,7 @@
               <w:rPr>
                 <w:lang w:val="fr-FR" w:eastAsia="fr-FR" w:bidi="fr-FR"/>
               </w:rPr>
-              <w:t>explicitation du contexte entreprise et de la mission en laboratoire de biologie medicale</w:t>
+              <w:t>explicitation du contexte entreprise et de la mission en laboratoire de biologie médicale</w:t>
             </w:r>
           </w:p>
         </w:tc>
@@ -1423,7 +1423,7 @@
               <w:rPr>
                 <w:lang w:val="fr-FR" w:eastAsia="fr-FR" w:bidi="fr-FR"/>
               </w:rPr>
-              <w:t>prise de recul sur l'experience. Accent probable sur le respect des protocoles, la tracabilite, l'hygiene, la sécurité et l'interpretation professionnelle des résultats</w:t>
+              <w:t>prise de recul sur l'experience. Accent probable sur le respect des protocoles, la traçabilité, l'hygiene, la sécurité et l'interpretation professionnelle des résultats</w:t>
             </w:r>
           </w:p>
         </w:tc>

</xml_diff>